<commit_message>
docs: 공통 서비스 주입을 @Autowired MngNotificationService로 변경, jsonView 확인 항목 추가
Co-Authored-By: Claude Opus 5.5 <noreply@anthropic.com>
Claude-Session: https://claude.ai/code/session_01AfmigTrFDfRpUQUkR9fb76
</commit_message>
<xml_diff>
--- a/docs/info-paging-change-spec.docx
+++ b/docs/info-paging-change-spec.docx
@@ -1600,7 +1600,7 @@
                 <w:sz w:val="16"/>
                 <w:szCs w:val="16"/>
               </w:rPr>
-              <w:t xml:space="preserve">import javax.annotation.Resource;</w:t>
+              <w:t xml:space="preserve">import org.springframework.beans.factory.annotation.Autowired;</w:t>
             </w:r>
           </w:p>
           <w:p>
@@ -2511,33 +2511,33 @@
                 <w:sz w:val="16"/>
                 <w:szCs w:val="16"/>
               </w:rPr>
-              <w:t xml:space="preserve">// /cmn/board/selectBoardListFile.do 가 사용하는 공통 서비스 (수정 없이 주입만)</w:t>
-            </w:r>
-          </w:p>
-          <w:p>
-            <w:pPr>
-              <w:spacing w:after="0" w:before="0" w:line="240"/>
-            </w:pPr>
-            <w:r>
-              <w:rPr>
-                <w:rFonts w:ascii="Consolas" w:cs="Consolas" w:eastAsia="Malgun Gothic" w:hAnsi="Consolas"/>
-                <w:sz w:val="16"/>
-                <w:szCs w:val="16"/>
-              </w:rPr>
-              <w:t xml:space="preserve">@Resource(name = "(공통 게시판 서비스 빈 이름)")</w:t>
-            </w:r>
-          </w:p>
-          <w:p>
-            <w:pPr>
-              <w:spacing w:after="0" w:before="0" w:line="240"/>
-            </w:pPr>
-            <w:r>
-              <w:rPr>
-                <w:rFonts w:ascii="Consolas" w:cs="Consolas" w:eastAsia="Malgun Gothic" w:hAnsi="Consolas"/>
-                <w:sz w:val="16"/>
-                <w:szCs w:val="16"/>
-              </w:rPr>
-              <w:t xml:space="preserve">private (공통 게시판 서비스 타입) boardService;</w:t>
+              <w:t xml:space="preserve">// 공통 게시판 서비스 (수정 없이 주입만). 컨트롤러에 이미 주입되어 있으면 이 선언은 생략</w:t>
+            </w:r>
+          </w:p>
+          <w:p>
+            <w:pPr>
+              <w:spacing w:after="0" w:before="0" w:line="240"/>
+            </w:pPr>
+            <w:r>
+              <w:rPr>
+                <w:rFonts w:ascii="Consolas" w:cs="Consolas" w:eastAsia="Malgun Gothic" w:hAnsi="Consolas"/>
+                <w:sz w:val="16"/>
+                <w:szCs w:val="16"/>
+              </w:rPr>
+              <w:t xml:space="preserve">@Autowired</w:t>
+            </w:r>
+          </w:p>
+          <w:p>
+            <w:pPr>
+              <w:spacing w:after="0" w:before="0" w:line="240"/>
+            </w:pPr>
+            <w:r>
+              <w:rPr>
+                <w:rFonts w:ascii="Consolas" w:cs="Consolas" w:eastAsia="Malgun Gothic" w:hAnsi="Consolas"/>
+                <w:sz w:val="16"/>
+                <w:szCs w:val="16"/>
+              </w:rPr>
+              <w:t xml:space="preserve">private MngNotificationService mngNotificationService;</w:t>
             </w:r>
           </w:p>
           <w:p>
@@ -2719,7 +2719,7 @@
                 <w:sz w:val="16"/>
                 <w:szCs w:val="16"/>
               </w:rPr>
-              <w:t xml:space="preserve">    return "jsonView";   // ※ 공통 API와 같은 JSON 반환 방식</w:t>
+              <w:t xml:space="preserve">    return "jsonView";   // dispatcher-servlet.xml에 등록된 JSON View 빈 이름 (공통 API와 같은 방식)</w:t>
             </w:r>
           </w:p>
           <w:p>
@@ -3083,20 +3083,20 @@
                 <w:sz w:val="16"/>
                 <w:szCs w:val="16"/>
               </w:rPr>
-              <w:t xml:space="preserve">    // 공통 selectBoardListFile.do와 같은 서비스 메서드 호출 (호출 후 후처리가 있으면 동일하게)</w:t>
-            </w:r>
-          </w:p>
-          <w:p>
-            <w:pPr>
-              <w:spacing w:after="0" w:before="0" w:line="240"/>
-            </w:pPr>
-            <w:r>
-              <w:rPr>
-                <w:rFonts w:ascii="Consolas" w:cs="Consolas" w:eastAsia="Malgun Gothic" w:hAnsi="Consolas"/>
-                <w:sz w:val="16"/>
-                <w:szCs w:val="16"/>
-              </w:rPr>
-              <w:t xml:space="preserve">    List&lt;MngNotificationVO&gt; all = boardService.selectBoardListFile(body);</w:t>
+              <w:t xml:space="preserve">    // 공통 selectBoardListFile.do가 호출하는 것과 같은 메서드 (메서드명은 실제 이름으로, 후처리가 있으면 동일하게)</w:t>
+            </w:r>
+          </w:p>
+          <w:p>
+            <w:pPr>
+              <w:spacing w:after="0" w:before="0" w:line="240"/>
+            </w:pPr>
+            <w:r>
+              <w:rPr>
+                <w:rFonts w:ascii="Consolas" w:cs="Consolas" w:eastAsia="Malgun Gothic" w:hAnsi="Consolas"/>
+                <w:sz w:val="16"/>
+                <w:szCs w:val="16"/>
+              </w:rPr>
+              <w:t xml:space="preserve">    List&lt;MngNotificationVO&gt; all = mngNotificationService.selectBoardListFile(body);</w:t>
             </w:r>
           </w:p>
           <w:p>

</xml_diff>